<commit_message>
Update owner contract to align with current Colombian rental law (Ley 820/2003, Decreto 1077/2015, IPC reajuste)
</commit_message>
<xml_diff>
--- a/Contrato_Arrendamiento_Propietario.docx
+++ b/Contrato_Arrendamiento_Propietario.docx
@@ -69,7 +69,7 @@
     </w:p>
     <w:p>
       <w:r>
-        <w:t>Por medio del presente Contrato, el ARRENDADOR entrega a título de arrendamiento el inmueble ubicado en [DIRECCIÓN COMPLETA DEL INMUEBLE], [descripción del inmueble: piso, número de habitaciones, baños, etc.], destinado exclusivamente para el uso de vivienda urbana del ARRENDATARIO y su grupo familiar.</w:t>
+        <w:t>Por medio del presente Contrato, el ARRENDADOR entrega a título de arrendamiento el inmueble ubicado en [DIRECCIÓN COMPLETA DEL INMUEBLE], [descripción del inmueble: piso, número de habitaciones, baños, etc.], destinado exclusivamente para el uso de vivienda urbana del ARRENDATARIO y su grupo familiar, conforme al artículo 2 de la Ley 820 de 2003.</w:t>
       </w:r>
     </w:p>
     <w:p>
@@ -93,7 +93,7 @@
     </w:p>
     <w:p>
       <w:r>
-        <w:t>Cada doce (12) meses de ejecución del Contrato, el valor del canon de arrendamiento será reajustado en una proporción igual a lo estipulado por la ley de acuerdo a la inflación anual de cada año, sin exceder en todo caso el límite máximo de reajuste fijado por la ley.</w:t>
+        <w:t>Cada doce (12) meses de ejecución del Contrato, el valor del canon de arrendamiento será reajustado en una proporción igual al porcentaje de incremento del Índice de Precios al Consumidor (IPC) certificado por el Departamento Administrativo Nacional de Estadística (DANE) para el período anual inmediatamente anterior, sin exceder en todo caso el límite máximo de reajuste fijado por la ley, conforme al artículo 20 de la Ley 820 de 2003 y el Decreto 1077 de 2015.</w:t>
       </w:r>
     </w:p>
     <w:p>
@@ -104,7 +104,7 @@
         <w:t xml:space="preserve">PARÁGRAFO 1: </w:t>
       </w:r>
       <w:r>
-        <w:t>Si el límite máximo de reajuste del canon de arrendamiento señalado por ley llegare a variar por alguna disposición legal posterior a la fecha de firma del presente Contrato, las partes acuerdan que el porcentaje de reajuste que se aplicará al canon de arrendamiento fijado en este Contrato, será el máximo permitido por la ley para la fecha en que el canon de arrendamiento deba ser reajustado.</w:t>
+        <w:t>Si el límite máximo de reajuste del canon de arrendamiento señalado por ley llegare a variar por alguna disposición legal posterior a la fecha de firma del presente Contrato, las partes acuerdan que el porcentaje de reajuste que se aplicará al canon de arrendamiento fijado en este Contrato será el máximo permitido por la ley para la fecha en que el canon de arrendamiento deba ser reajustado.</w:t>
       </w:r>
     </w:p>
     <w:p>
@@ -115,7 +115,7 @@
         <w:t xml:space="preserve">PARÁGRAFO 2: </w:t>
       </w:r>
       <w:r>
-        <w:t>La tolerancia del ARRENDADOR en recibir el pago del canon de arrendamiento con posterioridad al plazo indicado para ello en esta Cláusula, no podrá entenderse, en ningún caso, como ánimo del ARRENDADOR de modificar el término establecido en este Contrato para el pago del canon.</w:t>
+        <w:t>La tolerancia del ARRENDADOR en recibir el pago del canon de arrendamiento con posterioridad al plazo indicado para ello en esta Cláusula, no podrá entenderse, en ningún caso, como ánimo del ARRENDADOR de modificar el término establecido en este Contrato para el pago del canon, conforme al artículo 16 de la Ley 820 de 2003.</w:t>
       </w:r>
     </w:p>
     <w:p>
@@ -134,7 +134,7 @@
     </w:p>
     <w:p>
       <w:r>
-        <w:t>Dicho depósito será devuelto al ARRENDATARIO dentro de los [NÚMERO] días siguientes a la entrega del inmueble, previa verificación de que el mismo se encuentra en las condiciones en que fue entregado, salvo deterioro natural por uso legítimo, y previa deducción de los valores adeudados por concepto de arriendos, servicios públicos, reparaciones locativas, daños causados o cualquier otra obligación pendiente a cargo del ARRENDATARIO.</w:t>
+        <w:t>Dicho depósito será devuelto al ARRENDATARIO dentro de los treinta (30) días calendario siguientes a la entrega del inmueble, previa verificación de que el mismo se encuentra en las condiciones en que fue entregado, salvo deterioro natural por uso legítimo, y previa deducción de los valores adeudados por concepto de arriendos, servicios públicos, reparaciones locativas, daños causados o cualquier otra obligación pendiente a cargo del ARRENDATARIO.</w:t>
       </w:r>
     </w:p>
     <w:p>
@@ -148,7 +148,7 @@
     </w:p>
     <w:p>
       <w:r>
-        <w:t>El arrendamiento tendrá una duración de [1 / 2 / 3] año(s), contados a partir del [FECHA DE INICIO]. No obstante lo anterior, el término del arrendamiento se prorrogará automáticamente por periodos consecutivos iguales al inicial siempre que cada una de las partes haya cumplido con las obligaciones a su cargo y el ARRENDATARIO se avenga a los reajustes de la renta autorizados por ley.</w:t>
+        <w:t>El arrendamiento tendrá una duración de [1 / 2 / 3] año(s), contados a partir del [FECHA DE INICIO], fecha en la cual se hará la entrega material del inmueble al ARRENDATARIO. No obstante lo anterior, el término del arrendamiento se prorrogará automáticamente por periodos consecutivos iguales al inicial siempre que cada una de las partes haya cumplido con las obligaciones a su cargo y el ARRENDATARIO se avenga a los reajustes de la renta autorizados por ley, conforme al artículo 21 de la Ley 820 de 2003.</w:t>
       </w:r>
     </w:p>
     <w:p>
@@ -180,7 +180,63 @@
         <w:pStyle w:val="ListBullet"/>
       </w:pPr>
       <w:r>
-        <w:t>[DESCRIPCIÓN DE ELEMENTOS DEL INMUEBLE: ventanería, puertas, rejas, cocina, baños, lavadero, luces, llaves, controles, etc.]</w:t>
+        <w:t>[ ] Ventanería, puerta principal y puertas interiores en buen estado</w:t>
+      </w:r>
+    </w:p>
+    <w:p>
+      <w:pPr>
+        <w:pStyle w:val="ListBullet"/>
+      </w:pPr>
+      <w:r>
+        <w:t>[ ] Rejas de seguridad en buen estado</w:t>
+      </w:r>
+    </w:p>
+    <w:p>
+      <w:pPr>
+        <w:pStyle w:val="ListBullet"/>
+      </w:pPr>
+      <w:r>
+        <w:t>[ ] Cocina con gabinetes, estufa, extractor, lavaplatos y grifería completa</w:t>
+      </w:r>
+    </w:p>
+    <w:p>
+      <w:pPr>
+        <w:pStyle w:val="ListBullet"/>
+      </w:pPr>
+      <w:r>
+        <w:t>[ ] Baño(s) con grifería completa, lavamanos, sanitario y divisiones en buen estado</w:t>
+      </w:r>
+    </w:p>
+    <w:p>
+      <w:pPr>
+        <w:pStyle w:val="ListBullet"/>
+      </w:pPr>
+      <w:r>
+        <w:t>[ ] Instalaciones eléctricas, de agua y gas en buen estado</w:t>
+      </w:r>
+    </w:p>
+    <w:p>
+      <w:pPr>
+        <w:pStyle w:val="ListBullet"/>
+      </w:pPr>
+      <w:r>
+        <w:t>[ ] Pisos, paredes y techos en buen estado</w:t>
+      </w:r>
+    </w:p>
+    <w:p>
+      <w:pPr>
+        <w:pStyle w:val="ListBullet"/>
+      </w:pPr>
+      <w:r>
+        <w:t>[ ] Llaves y controles de acceso entregados: [NÚMERO]</w:t>
+      </w:r>
+    </w:p>
+    <w:p>
+      <w:pPr>
+        <w:pStyle w:val="ListBullet"/>
+      </w:pPr>
+      <w:r>
+        <w:t>[ ] Otros: [DESCRIBIR]</w:t>
       </w:r>
     </w:p>
     <w:p>
@@ -285,7 +341,7 @@
     </w:p>
     <w:p>
       <w:r>
-        <w:t>Terminado el contrato en los términos establecidos en el presente documento y de conformidad con la ley, el ARRENDATARIO (i) restituirá el inmueble al ARRENDADOR en las mismas buenas condiciones en que lo recibió del ARRENDADOR, salvo el deterioro natural causado por el uso legítimo; (ii) entregará al ARRENDADOR los ejemplares originales de las facturas de cobro por concepto de servicios públicos del inmueble correspondientes a los últimos tres (3) meses, debidamente canceladas por el ARRENDATARIO, con una antelación de dos (2) días hábiles a la fecha fijada para la restitución material del inmueble.</w:t>
+        <w:t>Terminado el contrato en los términos establecidos en el presente documento y de conformidad con la ley, el ARRENDATARIO (i) restituirá el inmueble al ARRENDADOR en las mismas buenas condiciones en que lo recibió del ARRENDADOR, salvo el deterioro natural causado por el uso legítimo; (ii) entregará al ARRENDADOR los ejemplares originales de las facturas de cobro por concepto de servicios públicos del inmueble correspondientes a los últimos tres (3) meses, debidamente canceladas por el ARRENDATARIO, con una antelación de dos (2) días hábiles a la fecha fijada para la restitución material del inmueble al ARRENDADOR.</w:t>
       </w:r>
     </w:p>
     <w:p>
@@ -330,12 +386,12 @@
           <w:b/>
           <w:sz w:val="22"/>
         </w:rPr>
-        <w:t>DÉCIMA PRIMERA. - INCUMPLIMIENTO</w:t>
+        <w:t>DÉCIMA PRIMERA. - INCUMPLIMIENTO Y TERMINACIÓN UNILATERAL</w:t>
       </w:r>
     </w:p>
     <w:p>
       <w:r>
-        <w:t>El incumplimiento del ARRENDATARIO a cualquiera de sus obligaciones legales o contractuales faculta al ARRENDADOR para ejercer las siguientes acciones, simultáneamente o en el orden que él elija:</w:t>
+        <w:t>El incumplimiento del ARRENDATARIO a cualquiera de sus obligaciones legales o contractuales faculta al ARRENDADOR para ejercer las siguientes acciones, simultáneamente o en el orden que él elija, conforme a los artículos 22 y 23 de la Ley 820 de 2003:</w:t>
       </w:r>
     </w:p>
     <w:p>
@@ -390,7 +446,7 @@
     </w:p>
     <w:p>
       <w:r>
-        <w:t>El ARRENDATARIO declara de manera expresa que reconoce y acepta que este Contrato presta mérito ejecutivo para exigir del ARRENDATARIO y a favor del ARRENDADOR el pago de: (i) los cánones de arrendamiento causados y no pagados; (ii) las multas y sanciones que se causen por incumplimiento de cualquiera de las obligaciones a su cargo; (iii) las sumas causadas y no pagadas por concepto de servicios públicos, cuotas de administración y cualquier otra suma de dinero que por cualquier concepto deba ser pagada por el ARRENDATARIO.</w:t>
+        <w:t>El ARRENDATARIO declara de manera expresa que reconoce y acepta que este Contrato presta mérito ejecutivo para exigir del ARRENDATARIO y a favor del ARRENDADOR el pago de: (i) los cánones de arrendamiento causados y no pagados; (ii) las multas y sanciones que se causen por incumplimiento de cualquiera de las obligaciones a su cargo; (iii) las sumas causadas y no pagadas por concepto de servicios públicos, cuotas de administración y cualquier otra suma de dinero que por cualquier concepto deba ser pagada por el ARRENDATARIO, conforme al artículo 7 de la Ley 820 de 2003.</w:t>
       </w:r>
     </w:p>
     <w:p>
@@ -415,7 +471,7 @@
     </w:p>
     <w:p>
       <w:r>
-        <w:t>El ARRENDADOR podrá dar por terminado el presente Contrato de conformidad con los artículos 22 y 23 del capítulo VII de la Ley 820 de 2003. El ARRENDATARIO podrá dar por terminado unilateralmente el Contrato a la fecha de vencimiento del término inicial o de sus prórrogas, siempre y cuando dé previo aviso escrito al ARRENDADOR con una antelación no menor de tres (3) meses a la referida fecha de vencimiento. La terminación unilateral en cualquier otro momento solo se aceptará previo pago de una indemnización equivalente al precio de tres (3) meses de arrendamiento vigente.</w:t>
+        <w:t>El ARRENDADOR podrá dar por terminado el presente Contrato de conformidad con los artículos 22 y 23 del capítulo VII de la Ley 820 de 2003. El ARRENDATARIO podrá dar por terminado unilateralmente el Contrato a la fecha de vencimiento del término inicial o de sus prórrogas, siempre y cuando dé previo aviso escrito al ARRENDADOR con una antelación no menor de tres (3) meses a la referida fecha de vencimiento, conforme al artículo 24 de la Ley 820 de 2003. La terminación unilateral en cualquier otro momento solo se aceptará previo pago de una indemnización equivalente al precio de tres (3) meses de arrendamiento vigente, conforme al artículo 25 de la Ley 820 de 2003.</w:t>
       </w:r>
     </w:p>
     <w:p>
@@ -434,7 +490,7 @@
     </w:p>
     <w:p>
       <w:r>
-        <w:t>En el evento de que los perjuicios ocasionados por la parte incumplida excedan el valor de la suma aquí prevista como pena, la parte incumplida deberá pagar a la otra parte la diferencia entre el valor total de los perjuicios y el valor de la pena prevista en esta Cláusula.</w:t>
+        <w:t>En el evento de que los perjuicios ocasionados por la parte incumplida excedan el valor de la suma aquí prevista como pena, la parte incumplida deberá pagar a la otra parte la diferencia entre el valor total de los perjuicios y el valor de la pena prevista en esta Cláusula, conforme al artículo 1617 del Código Civil.</w:t>
       </w:r>
     </w:p>
     <w:p>
@@ -462,7 +518,7 @@
     </w:p>
     <w:p>
       <w:r>
-        <w:t>El ARRENDATARIO autoriza de manera expresa e irrevocable al ARRENDADOR para ingresar al inmueble y recuperar su tenencia, con el solo requisito de la presencia de dos (2) testigos, en procura de evitar el deterioro o desmantelamiento del inmueble, en el evento de que por cualquier causa o circunstancia el inmueble permanezca abandonado o deshabitado por el término de dos (2) meses o más y que la exposición al riesgo sea tal que amenace la integridad física del bien o la seguridad del vecindario.</w:t>
+        <w:t>El ARRENDATARIO autoriza de manera expresa e irrevocable al ARRENDADOR para ingresar al inmueble y recuperar su tenencia, con el solo requisito de la presencia de dos (2) testigos, en procura de evitar el deterioro o desmantelamiento del inmueble, en el evento de que por cualquier causa o circunstancia el inmueble permanezca abandonado o deshabitado por el término de dos (2) meses o más y que la exposición al riesgo sea tal que amenace la integridad física del bien o la seguridad del vecindario, conforme al artículo 27 de la Ley 820 de 2003.</w:t>
       </w:r>
     </w:p>
     <w:p>
@@ -476,7 +532,7 @@
     </w:p>
     <w:p>
       <w:r>
-        <w:t>Los COARRENDATARIOS, en caso de intervenir en este Contrato, se obligan de manera solidaria y hasta la entera satisfacción del ARRENDADOR, durante la vigencia de este Contrato y hasta que el inmueble sea devuelto en las condiciones pactadas.</w:t>
+        <w:t>Los COARRENDATARIOS, en caso de intervenir en este Contrato, responden de manera solidaria y hasta la entera satisfacción del ARRENDADOR, durante la vigencia de este Contrato y hasta que el inmueble sea devuelto en las condiciones pactadas.</w:t>
       </w:r>
     </w:p>
     <w:p>
@@ -554,10 +610,9 @@
         <w:t>FIRMAS Y CONSTANCIA</w:t>
       </w:r>
     </w:p>
-    <w:p/>
     <w:p>
       <w:r>
-        <w:t>Para constancia, el presente Contrato es suscrito en [CIUDAD], el día [DD] de [MES] de [AAAA], en [NÚMERO] ejemplares de igual valor, cada uno de ellos con destino a cada una de las partes.</w:t>
+        <w:t>Para constancia, el presente Contrato es suscrito en [CIUDAD], el día [DD] de [MES] de [AAAA], en dos (2) ejemplares de igual valor, cada uno de ellos con destino a cada una de las partes.</w:t>
       </w:r>
     </w:p>
     <w:p/>

</xml_diff>

<commit_message>
Align legal references strictly with source contracts: remove extra article citations
</commit_message>
<xml_diff>
--- a/Contrato_Arrendamiento_Propietario.docx
+++ b/Contrato_Arrendamiento_Propietario.docx
@@ -40,12 +40,12 @@
     </w:p>
     <w:p>
       <w:r>
-        <w:t>[NOMBRE COMPLETO DEL PROPIETARIO / ARRENDADOR], [mujer/hombre], de nacionalidad [NACIONALIDAD], con domicilio en [CIUDAD / DEPARTAMENTO], [estado civil], identificado(a) con la [CÉDULA DE CIUDADANÍA / CÉDULA DE EXTRANJERÍA / PASAPORTE] número [NÚMERO DE DOCUMENTO] de [CIUDAD DE EXPEDICIÓN], quien obra en nombre propio y que para efectos de este contrato se denominará el "ARRENDADOR", por una parte;</w:t>
+        <w:t>[NOMBRE COMPLETO DEL PROPIETARIO / ARRENDADOR], mayor de edad, [nacionalidad], con domicilio en [CIUDAD / DEPARTAMENTO], [estado civil], identificado(a) con la [CÉDULA DE CIUDADANÍA / CÉDULA DE EXTRANJERÍA / PASAPORTE] número [NÚMERO DE DOCUMENTO] de [CIUDAD DE EXPEDICIÓN], quien obra en nombre propio y que para efectos de este contrato se denominará el "ARRENDADOR", por una parte;</w:t>
       </w:r>
     </w:p>
     <w:p>
       <w:r>
-        <w:t>y por la otra, [NOMBRE COMPLETO DEL ARRENDATARIO], [mujer/hombre], de nacionalidad [NACIONALIDAD], identificado(a) con la [CÉDULA DE CIUDADANÍA / CÉDULA DE EXTRANJERÍA / PASAPORTE] número [NÚMERO DE DOCUMENTO] de [CIUDAD DE EXPEDICIÓN], quien para efectos de este contrato obra en nombre propio y se denominará el "ARRENDATARIO".</w:t>
+        <w:t>y por la otra, [NOMBRE COMPLETO DEL ARRENDATARIO], mayor de edad, [nacionalidad], identificado(a) con la [CÉDULA DE CIUDADANÍA / CÉDULA DE EXTRANJERÍA / PASAPORTE] número [NÚMERO DE DOCUMENTO] de [CIUDAD DE EXPEDICIÓN], quien para efectos de este contrato obra en nombre propio y se denominará el "ARRENDATARIO".</w:t>
       </w:r>
     </w:p>
     <w:p>
@@ -69,7 +69,7 @@
     </w:p>
     <w:p>
       <w:r>
-        <w:t>Por medio del presente Contrato, el ARRENDADOR entrega a título de arrendamiento el inmueble ubicado en [DIRECCIÓN COMPLETA DEL INMUEBLE], [descripción del inmueble: piso, número de habitaciones, baños, etc.], destinado exclusivamente para el uso de vivienda urbana del ARRENDATARIO y su grupo familiar, conforme al artículo 2 de la Ley 820 de 2003.</w:t>
+        <w:t>Por medio del presente Contrato, el ARRENDADOR entrega a título de arrendamiento el inmueble ubicado en [DIRECCIÓN COMPLETA DEL INMUEBLE], [descripción del inmueble: piso, número de habitaciones, baños, etc.], destinado exclusivamente para el uso de vivienda urbana del ARRENDATARIO y su grupo familiar, conforme a la Ley 820 de 2003.</w:t>
       </w:r>
     </w:p>
     <w:p>
@@ -93,7 +93,7 @@
     </w:p>
     <w:p>
       <w:r>
-        <w:t>Cada doce (12) meses de ejecución del Contrato, el valor del canon de arrendamiento será reajustado en una proporción igual al porcentaje de incremento del Índice de Precios al Consumidor (IPC) certificado por el Departamento Administrativo Nacional de Estadística (DANE) para el período anual inmediatamente anterior, sin exceder en todo caso el límite máximo de reajuste fijado por la ley, conforme al artículo 20 de la Ley 820 de 2003 y el Decreto 1077 de 2015.</w:t>
+        <w:t>Cada doce (12) meses de ejecución del Contrato, el valor del canon de arrendamiento será reajustado en una proporción igual a lo estipulado por la ley de acuerdo a la inflación anual de cada año, sin exceder en todo caso el límite máximo de reajuste fijado por la ley, conforme al artículo 20 de la Ley 820 de 2003.</w:t>
       </w:r>
     </w:p>
     <w:p>
@@ -115,7 +115,7 @@
         <w:t xml:space="preserve">PARÁGRAFO 2: </w:t>
       </w:r>
       <w:r>
-        <w:t>La tolerancia del ARRENDADOR en recibir el pago del canon de arrendamiento con posterioridad al plazo indicado para ello en esta Cláusula, no podrá entenderse, en ningún caso, como ánimo del ARRENDADOR de modificar el término establecido en este Contrato para el pago del canon, conforme al artículo 16 de la Ley 820 de 2003.</w:t>
+        <w:t>La tolerancia del ARRENDADOR en recibir el pago del canon de arrendamiento con posterioridad al plazo indicado para ello en esta Cláusula, no podrá entenderse, en ningún caso, como ánimo del ARRENDADOR de modificar el término establecido en este Contrato para el pago del canon.</w:t>
       </w:r>
     </w:p>
     <w:p>
@@ -134,7 +134,7 @@
     </w:p>
     <w:p>
       <w:r>
-        <w:t>Dicho depósito será devuelto al ARRENDATARIO dentro de los treinta (30) días calendario siguientes a la entrega del inmueble, previa verificación de que el mismo se encuentra en las condiciones en que fue entregado, salvo deterioro natural por uso legítimo, y previa deducción de los valores adeudados por concepto de arriendos, servicios públicos, reparaciones locativas, daños causados o cualquier otra obligación pendiente a cargo del ARRENDATARIO.</w:t>
+        <w:t>Dicho depósito será devuelto al ARRENDATARIO dentro de los [NÚMERO] días siguientes a la entrega del inmueble, previa verificación de que el mismo se encuentra en las condiciones en que fue entregado, salvo deterioro natural por uso legítimo, y previa deducción de los valores adeudados por concepto de arriendos, servicios públicos, reparaciones locativas, daños causados o cualquier otra obligación pendiente a cargo del ARRENDATARIO.</w:t>
       </w:r>
     </w:p>
     <w:p>
@@ -148,7 +148,7 @@
     </w:p>
     <w:p>
       <w:r>
-        <w:t>El arrendamiento tendrá una duración de [1 / 2 / 3] año(s), contados a partir del [FECHA DE INICIO], fecha en la cual se hará la entrega material del inmueble al ARRENDATARIO. No obstante lo anterior, el término del arrendamiento se prorrogará automáticamente por periodos consecutivos iguales al inicial siempre que cada una de las partes haya cumplido con las obligaciones a su cargo y el ARRENDATARIO se avenga a los reajustes de la renta autorizados por ley, conforme al artículo 21 de la Ley 820 de 2003.</w:t>
+        <w:t>El arrendamiento tendrá una duración de [1 / 2 / 3] año(s), contados a partir del [FECHA DE INICIO]. No obstante lo anterior, el término del arrendamiento se prorrogará automáticamente por periodos consecutivos iguales al inicial siempre que cada una de las partes haya cumplido con las obligaciones a su cargo y el ARRENDATARIO se avenga a los reajustes de la renta autorizados por ley, conforme a la Ley 820 de 2003.</w:t>
       </w:r>
     </w:p>
     <w:p>
@@ -391,7 +391,7 @@
     </w:p>
     <w:p>
       <w:r>
-        <w:t>El incumplimiento del ARRENDATARIO a cualquiera de sus obligaciones legales o contractuales faculta al ARRENDADOR para ejercer las siguientes acciones, simultáneamente o en el orden que él elija, conforme a los artículos 22 y 23 de la Ley 820 de 2003:</w:t>
+        <w:t>El incumplimiento del ARRENDATARIO a cualquiera de sus obligaciones legales o contractuales faculta al ARRENDADOR para ejercer las siguientes acciones, simultáneamente o en el orden que él elija:</w:t>
       </w:r>
     </w:p>
     <w:p>
@@ -446,7 +446,7 @@
     </w:p>
     <w:p>
       <w:r>
-        <w:t>El ARRENDATARIO declara de manera expresa que reconoce y acepta que este Contrato presta mérito ejecutivo para exigir del ARRENDATARIO y a favor del ARRENDADOR el pago de: (i) los cánones de arrendamiento causados y no pagados; (ii) las multas y sanciones que se causen por incumplimiento de cualquiera de las obligaciones a su cargo; (iii) las sumas causadas y no pagadas por concepto de servicios públicos, cuotas de administración y cualquier otra suma de dinero que por cualquier concepto deba ser pagada por el ARRENDATARIO, conforme al artículo 7 de la Ley 820 de 2003.</w:t>
+        <w:t>El ARRENDATARIO declara de manera expresa que reconoce y acepta que este Contrato presta mérito ejecutivo para exigir del ARRENDATARIO y a favor del ARRENDADOR el pago de: (i) los cánones de arrendamiento causados y no pagados; (ii) las multas y sanciones que se causen por incumplimiento de cualquiera de las obligaciones a su cargo; (iii) las sumas causadas y no pagadas por concepto de servicios públicos, cuotas de administración y cualquier otra suma de dinero que por cualquier concepto deba ser pagada por el ARRENDATARIO.</w:t>
       </w:r>
     </w:p>
     <w:p>
@@ -471,7 +471,7 @@
     </w:p>
     <w:p>
       <w:r>
-        <w:t>El ARRENDADOR podrá dar por terminado el presente Contrato de conformidad con los artículos 22 y 23 del capítulo VII de la Ley 820 de 2003. El ARRENDATARIO podrá dar por terminado unilateralmente el Contrato a la fecha de vencimiento del término inicial o de sus prórrogas, siempre y cuando dé previo aviso escrito al ARRENDADOR con una antelación no menor de tres (3) meses a la referida fecha de vencimiento, conforme al artículo 24 de la Ley 820 de 2003. La terminación unilateral en cualquier otro momento solo se aceptará previo pago de una indemnización equivalente al precio de tres (3) meses de arrendamiento vigente, conforme al artículo 25 de la Ley 820 de 2003.</w:t>
+        <w:t>El ARRENDADOR podrá dar por terminado el presente Contrato de conformidad con los artículos 22 y 23 del capítulo VII de la Ley 820 de 2003. El ARRENDATARIO podrá dar por terminado unilateralmente el Contrato a la fecha de vencimiento del término inicial o de sus prórrogas, siempre y cuando dé previo aviso escrito al ARRENDADOR con una antelación no menor de tres (3) meses a la referida fecha de vencimiento. La terminación unilateral en cualquier otro momento solo se aceptará previo pago de una indemnización equivalente al precio de tres (3) meses de arrendamiento vigente.</w:t>
       </w:r>
     </w:p>
     <w:p>
@@ -490,7 +490,7 @@
     </w:p>
     <w:p>
       <w:r>
-        <w:t>En el evento de que los perjuicios ocasionados por la parte incumplida excedan el valor de la suma aquí prevista como pena, la parte incumplida deberá pagar a la otra parte la diferencia entre el valor total de los perjuicios y el valor de la pena prevista en esta Cláusula, conforme al artículo 1617 del Código Civil.</w:t>
+        <w:t>En el evento de que los perjuicios ocasionados por la parte incumplida excedan el valor de la suma aquí prevista como pena, la parte incumplida deberá pagar a la otra parte la diferencia entre el valor total de los perjuicios y el valor de la pena prevista en esta Cláusula.</w:t>
       </w:r>
     </w:p>
     <w:p>
@@ -504,7 +504,7 @@
     </w:p>
     <w:p>
       <w:r>
-        <w:t>El ARRENDATARIO y, en su caso, los COARRENDATARIOS autorizan de manera expresa e irrevocable al ARRENDADOR y/o al cesionario de este Contrato a consultar información que obre en las bases de datos de comportamiento financiero y crediticio o centrales de riesgo que existan en el país, así como a reportar a dichas bases de datos cualquier incumplimiento a este Contrato, de conformidad con la Ley 1266 de 2008, el Decreto 1377 de 2013 y demás normas concordantes.</w:t>
+        <w:t>El ARRENDATARIO y, en su caso, los COARRENDATARIOS autorizan de manera expresa e irrevocable al ARRENDADOR y/o al cesionario de este Contrato a consultar información que obre en las bases de datos de comportamiento financiero y crediticio o centrales de riesgo que existan en el país, así como a reportar a dichas bases de datos cualquier incumplimiento a este Contrato, de conformidad con la Ley 1266 de 2008 y el Decreto 1377 de 2013.</w:t>
       </w:r>
     </w:p>
     <w:p>
@@ -518,7 +518,7 @@
     </w:p>
     <w:p>
       <w:r>
-        <w:t>El ARRENDATARIO autoriza de manera expresa e irrevocable al ARRENDADOR para ingresar al inmueble y recuperar su tenencia, con el solo requisito de la presencia de dos (2) testigos, en procura de evitar el deterioro o desmantelamiento del inmueble, en el evento de que por cualquier causa o circunstancia el inmueble permanezca abandonado o deshabitado por el término de dos (2) meses o más y que la exposición al riesgo sea tal que amenace la integridad física del bien o la seguridad del vecindario, conforme al artículo 27 de la Ley 820 de 2003.</w:t>
+        <w:t>El ARRENDATARIO autoriza de manera expresa e irrevocable al ARRENDADOR para ingresar al inmueble y recuperar su tenencia, con el solo requisito de la presencia de dos (2) testigos, en procura de evitar el deterioro o desmantelamiento del inmueble, en el evento de que por cualquier causa o circunstancia el inmueble permanezca abandonado o deshabitado por el término de dos (2) meses o más y que la exposición al riesgo sea tal que amenace la integridad física del bien o la seguridad del vecindario.</w:t>
       </w:r>
     </w:p>
     <w:p>

</xml_diff>